<commit_message>
Add SQL scripts for customer ward management in UAT13
- Create Audit_UAT13_Customer_Ward_AI.sql to aggregate customer data by account and suggest wards based on address matching.
- Implement Fix_UAT13_Representative_Customer_Ward_AI.sql to update representative customers with missing ward information, including backup and transaction handling.
</commit_message>
<xml_diff>
--- a/docs/GOI_UAT_KHACH_HANG/01_HUONG_DAN_SU_DUNG_MEDSTAND_AI.docx
+++ b/docs/GOI_UAT_KHACH_HANG/01_HUONG_DAN_SU_DUNG_MEDSTAND_AI.docx
@@ -623,72 +623,6 @@
           <w:szCs w:val="32"/>
         </w:rPr>
         <w:t xml:space="preserve">1. Bắt đầu trong 5 phút</w:t>
-      </w:r>
-    </w:p>
-    <w:p>
-      <w:pPr>
-        <w:spacing w:after="80" w:before="120"/>
-        <w:jc w:val="center"/>
-      </w:pPr>
-      <w:r>
-        <w:drawing>
-          <wp:inline distT="0" distB="0" distL="0" distR="0">
-            <wp:extent cx="5905500" cy="1314450"/>
-            <wp:effectExtent t="0" r="0" b="0" l="0"/>
-            <wp:docPr id="1" name="so_do_quy_trinh_5_buoc.png" descr="Sơ đồ năm bước: đăng nhập, chọn chức năng, nhập thông tin, đọc kết quả và phản hồi." title="Hình 1 — Quy trình sử dụng nhanh gồm 5 bước."/>
-            <wp:cNvGraphicFramePr>
-              <a:graphicFrameLocks xmlns:a="http://schemas.openxmlformats.org/drawingml/2006/main" noChangeAspect="1"/>
-            </wp:cNvGraphicFramePr>
-            <a:graphic xmlns:a="http://schemas.openxmlformats.org/drawingml/2006/main">
-              <a:graphicData uri="http://schemas.openxmlformats.org/drawingml/2006/picture">
-                <pic:pic xmlns:pic="http://schemas.openxmlformats.org/drawingml/2006/picture">
-                  <pic:nvPicPr>
-                    <pic:cNvPr id="0" name="" descr=""/>
-                    <pic:cNvPicPr>
-                      <a:picLocks noChangeAspect="1" noChangeArrowheads="1"/>
-                    </pic:cNvPicPr>
-                  </pic:nvPicPr>
-                  <pic:blipFill>
-                    <a:blip r:embed="rId9" cstate="none"/>
-                    <a:srcRect/>
-                    <a:stretch>
-                      <a:fillRect/>
-                    </a:stretch>
-                  </pic:blipFill>
-                  <pic:spPr bwMode="auto">
-                    <a:xfrm>
-                      <a:off x="0" y="0"/>
-                      <a:ext cx="5905500" cy="1314450"/>
-                    </a:xfrm>
-                    <a:prstGeom prst="rect">
-                      <a:avLst/>
-                    </a:prstGeom>
-                  </pic:spPr>
-                </pic:pic>
-              </a:graphicData>
-            </a:graphic>
-          </wp:inline>
-        </w:drawing>
-      </w:r>
-    </w:p>
-    <w:p>
-      <w:pPr>
-        <w:keepNext w:val="false"/>
-        <w:spacing w:after="180" w:before="0" w:line="240"/>
-        <w:jc w:val="center"/>
-      </w:pPr>
-      <w:r>
-        <w:rPr>
-          <w:rFonts w:ascii="Calibri" w:cs="Calibri" w:eastAsia="Calibri" w:hAnsi="Calibri"/>
-          <w:b w:val="false"/>
-          <w:bCs w:val="false"/>
-          <w:i/>
-          <w:iCs/>
-          <w:color w:val="5B6573"/>
-          <w:sz w:val="18"/>
-          <w:szCs w:val="18"/>
-        </w:rPr>
-        <w:t xml:space="preserve">Hình 1 — Quy trình sử dụng nhanh gồm 5 bước.</w:t>
       </w:r>
     </w:p>
     <w:p>
@@ -1184,72 +1118,6 @@
           <w:szCs w:val="32"/>
         </w:rPr>
         <w:t xml:space="preserve">2. Nhận biết màn hình Trợ lý AI</w:t>
-      </w:r>
-    </w:p>
-    <w:p>
-      <w:pPr>
-        <w:spacing w:after="80" w:before="120"/>
-        <w:jc w:val="center"/>
-      </w:pPr>
-      <w:r>
-        <w:drawing>
-          <wp:inline distT="0" distB="0" distL="0" distR="0">
-            <wp:extent cx="5905500" cy="3095625"/>
-            <wp:effectExtent t="0" r="0" b="0" l="0"/>
-            <wp:docPr id="1" name="01_MAN_HINH_TRO_LY_AI_SAU_DANG_NHAP.png" descr="Ảnh giao diện Medstand: menu trái, các nút chức năng nhanh và ô nhập câu hỏi ở cuối màn hình." title="Hình 2 — Màn hình Trợ lý AI sau khi đăng nhập."/>
-            <wp:cNvGraphicFramePr>
-              <a:graphicFrameLocks xmlns:a="http://schemas.openxmlformats.org/drawingml/2006/main" noChangeAspect="1"/>
-            </wp:cNvGraphicFramePr>
-            <a:graphic xmlns:a="http://schemas.openxmlformats.org/drawingml/2006/main">
-              <a:graphicData uri="http://schemas.openxmlformats.org/drawingml/2006/picture">
-                <pic:pic xmlns:pic="http://schemas.openxmlformats.org/drawingml/2006/picture">
-                  <pic:nvPicPr>
-                    <pic:cNvPr id="0" name="" descr=""/>
-                    <pic:cNvPicPr>
-                      <a:picLocks noChangeAspect="1" noChangeArrowheads="1"/>
-                    </pic:cNvPicPr>
-                  </pic:nvPicPr>
-                  <pic:blipFill>
-                    <a:blip r:embed="rId10" cstate="none"/>
-                    <a:srcRect/>
-                    <a:stretch>
-                      <a:fillRect/>
-                    </a:stretch>
-                  </pic:blipFill>
-                  <pic:spPr bwMode="auto">
-                    <a:xfrm>
-                      <a:off x="0" y="0"/>
-                      <a:ext cx="5905500" cy="3095625"/>
-                    </a:xfrm>
-                    <a:prstGeom prst="rect">
-                      <a:avLst/>
-                    </a:prstGeom>
-                  </pic:spPr>
-                </pic:pic>
-              </a:graphicData>
-            </a:graphic>
-          </wp:inline>
-        </w:drawing>
-      </w:r>
-    </w:p>
-    <w:p>
-      <w:pPr>
-        <w:keepNext w:val="false"/>
-        <w:spacing w:after="180" w:before="0" w:line="240"/>
-        <w:jc w:val="center"/>
-      </w:pPr>
-      <w:r>
-        <w:rPr>
-          <w:rFonts w:ascii="Calibri" w:cs="Calibri" w:eastAsia="Calibri" w:hAnsi="Calibri"/>
-          <w:b w:val="false"/>
-          <w:bCs w:val="false"/>
-          <w:i/>
-          <w:iCs/>
-          <w:color w:val="5B6573"/>
-          <w:sz w:val="18"/>
-          <w:szCs w:val="18"/>
-        </w:rPr>
-        <w:t xml:space="preserve">Hình 2 — Màn hình Trợ lý AI sau khi đăng nhập.</w:t>
       </w:r>
     </w:p>
     <w:tbl>
@@ -3337,72 +3205,6 @@
           <w:szCs w:val="32"/>
         </w:rPr>
         <w:t xml:space="preserve">4. Phạm vi dữ liệu theo vai trò</w:t>
-      </w:r>
-    </w:p>
-    <w:p>
-      <w:pPr>
-        <w:spacing w:after="80" w:before="120"/>
-        <w:jc w:val="center"/>
-      </w:pPr>
-      <w:r>
-        <w:drawing>
-          <wp:inline distT="0" distB="0" distL="0" distR="0">
-            <wp:extent cx="5905500" cy="1524000"/>
-            <wp:effectExtent t="0" r="0" b="0" l="0"/>
-            <wp:docPr id="1" name="so_do_pham_vi_vai_tro.png" descr="Sơ đồ phân quyền giữa nhân viên kinh doanh, quản lý và dữ liệu được phép xem." title="Hình 3 — Tài khoản chỉ xem dữ liệu thuộc phạm vi được cấp."/>
-            <wp:cNvGraphicFramePr>
-              <a:graphicFrameLocks xmlns:a="http://schemas.openxmlformats.org/drawingml/2006/main" noChangeAspect="1"/>
-            </wp:cNvGraphicFramePr>
-            <a:graphic xmlns:a="http://schemas.openxmlformats.org/drawingml/2006/main">
-              <a:graphicData uri="http://schemas.openxmlformats.org/drawingml/2006/picture">
-                <pic:pic xmlns:pic="http://schemas.openxmlformats.org/drawingml/2006/picture">
-                  <pic:nvPicPr>
-                    <pic:cNvPr id="0" name="" descr=""/>
-                    <pic:cNvPicPr>
-                      <a:picLocks noChangeAspect="1" noChangeArrowheads="1"/>
-                    </pic:cNvPicPr>
-                  </pic:nvPicPr>
-                  <pic:blipFill>
-                    <a:blip r:embed="rId11" cstate="none"/>
-                    <a:srcRect/>
-                    <a:stretch>
-                      <a:fillRect/>
-                    </a:stretch>
-                  </pic:blipFill>
-                  <pic:spPr bwMode="auto">
-                    <a:xfrm>
-                      <a:off x="0" y="0"/>
-                      <a:ext cx="5905500" cy="1524000"/>
-                    </a:xfrm>
-                    <a:prstGeom prst="rect">
-                      <a:avLst/>
-                    </a:prstGeom>
-                  </pic:spPr>
-                </pic:pic>
-              </a:graphicData>
-            </a:graphic>
-          </wp:inline>
-        </w:drawing>
-      </w:r>
-    </w:p>
-    <w:p>
-      <w:pPr>
-        <w:keepNext w:val="false"/>
-        <w:spacing w:after="180" w:before="0" w:line="240"/>
-        <w:jc w:val="center"/>
-      </w:pPr>
-      <w:r>
-        <w:rPr>
-          <w:rFonts w:ascii="Calibri" w:cs="Calibri" w:eastAsia="Calibri" w:hAnsi="Calibri"/>
-          <w:b w:val="false"/>
-          <w:bCs w:val="false"/>
-          <w:i/>
-          <w:iCs/>
-          <w:color w:val="5B6573"/>
-          <w:sz w:val="18"/>
-          <w:szCs w:val="18"/>
-        </w:rPr>
-        <w:t xml:space="preserve">Hình 3 — Tài khoản chỉ xem dữ liệu thuộc phạm vi được cấp.</w:t>
       </w:r>
     </w:p>
     <w:tbl>
@@ -5471,72 +5273,6 @@
         <w:t xml:space="preserve">6. Cách đọc một kết quả</w:t>
       </w:r>
     </w:p>
-    <w:p>
-      <w:pPr>
-        <w:spacing w:after="80" w:before="120"/>
-        <w:jc w:val="center"/>
-      </w:pPr>
-      <w:r>
-        <w:drawing>
-          <wp:inline distT="0" distB="0" distL="0" distR="0">
-            <wp:extent cx="5905500" cy="4191000"/>
-            <wp:effectExtent t="0" r="0" b="0" l="0"/>
-            <wp:docPr id="1" name="02_KET_QUA_DOANH_SO_DUNG.png" descr="Ảnh kết quả doanh số đội với khoảng ngày, tổng doanh số, số đơn, đơn trung bình và bảng nhân viên." title="Hình 4 — Ví dụ kết quả doanh số đúng: có khoảng thời gian, số tổng quan, nhóm phân tích và bảng chi tiết."/>
-            <wp:cNvGraphicFramePr>
-              <a:graphicFrameLocks xmlns:a="http://schemas.openxmlformats.org/drawingml/2006/main" noChangeAspect="1"/>
-            </wp:cNvGraphicFramePr>
-            <a:graphic xmlns:a="http://schemas.openxmlformats.org/drawingml/2006/main">
-              <a:graphicData uri="http://schemas.openxmlformats.org/drawingml/2006/picture">
-                <pic:pic xmlns:pic="http://schemas.openxmlformats.org/drawingml/2006/picture">
-                  <pic:nvPicPr>
-                    <pic:cNvPr id="0" name="" descr=""/>
-                    <pic:cNvPicPr>
-                      <a:picLocks noChangeAspect="1" noChangeArrowheads="1"/>
-                    </pic:cNvPicPr>
-                  </pic:nvPicPr>
-                  <pic:blipFill>
-                    <a:blip r:embed="rId12" cstate="none"/>
-                    <a:srcRect/>
-                    <a:stretch>
-                      <a:fillRect/>
-                    </a:stretch>
-                  </pic:blipFill>
-                  <pic:spPr bwMode="auto">
-                    <a:xfrm>
-                      <a:off x="0" y="0"/>
-                      <a:ext cx="5905500" cy="4191000"/>
-                    </a:xfrm>
-                    <a:prstGeom prst="rect">
-                      <a:avLst/>
-                    </a:prstGeom>
-                  </pic:spPr>
-                </pic:pic>
-              </a:graphicData>
-            </a:graphic>
-          </wp:inline>
-        </w:drawing>
-      </w:r>
-    </w:p>
-    <w:p>
-      <w:pPr>
-        <w:keepNext w:val="false"/>
-        <w:spacing w:after="180" w:before="0" w:line="240"/>
-        <w:jc w:val="center"/>
-      </w:pPr>
-      <w:r>
-        <w:rPr>
-          <w:rFonts w:ascii="Calibri" w:cs="Calibri" w:eastAsia="Calibri" w:hAnsi="Calibri"/>
-          <w:b w:val="false"/>
-          <w:bCs w:val="false"/>
-          <w:i/>
-          <w:iCs/>
-          <w:color w:val="5B6573"/>
-          <w:sz w:val="18"/>
-          <w:szCs w:val="18"/>
-        </w:rPr>
-        <w:t xml:space="preserve">Hình 4 — Ví dụ kết quả doanh số đúng: có khoảng thời gian, số tổng quan, nhóm phân tích và bảng chi tiết.</w:t>
-      </w:r>
-    </w:p>
     <w:tbl>
       <w:tblPr>
         <w:tblW w:type="dxa" w:w="9360"/>
@@ -8275,72 +8011,6 @@
           <w:szCs w:val="32"/>
         </w:rPr>
         <w:t xml:space="preserve">9. Tự xử lý lỗi theo sơ đồ</w:t>
-      </w:r>
-    </w:p>
-    <w:p>
-      <w:pPr>
-        <w:spacing w:after="80" w:before="120"/>
-        <w:jc w:val="center"/>
-      </w:pPr>
-      <w:r>
-        <w:drawing>
-          <wp:inline distT="0" distB="0" distL="0" distR="0">
-            <wp:extent cx="5905500" cy="2162175"/>
-            <wp:effectExtent t="0" r="0" b="0" l="0"/>
-            <wp:docPr id="1" name="so_do_cay_quyet_dinh_loi.png" descr="Cây quyết định: kiểm tra đăng nhập, tham số, phạm vi và gửi bằng chứng nếu lỗi còn lặp lại." title="Hình 5 — Sơ đồ quyết định khi kết quả không như mong đợi."/>
-            <wp:cNvGraphicFramePr>
-              <a:graphicFrameLocks xmlns:a="http://schemas.openxmlformats.org/drawingml/2006/main" noChangeAspect="1"/>
-            </wp:cNvGraphicFramePr>
-            <a:graphic xmlns:a="http://schemas.openxmlformats.org/drawingml/2006/main">
-              <a:graphicData uri="http://schemas.openxmlformats.org/drawingml/2006/picture">
-                <pic:pic xmlns:pic="http://schemas.openxmlformats.org/drawingml/2006/picture">
-                  <pic:nvPicPr>
-                    <pic:cNvPr id="0" name="" descr=""/>
-                    <pic:cNvPicPr>
-                      <a:picLocks noChangeAspect="1" noChangeArrowheads="1"/>
-                    </pic:cNvPicPr>
-                  </pic:nvPicPr>
-                  <pic:blipFill>
-                    <a:blip r:embed="rId13" cstate="none"/>
-                    <a:srcRect/>
-                    <a:stretch>
-                      <a:fillRect/>
-                    </a:stretch>
-                  </pic:blipFill>
-                  <pic:spPr bwMode="auto">
-                    <a:xfrm>
-                      <a:off x="0" y="0"/>
-                      <a:ext cx="5905500" cy="2162175"/>
-                    </a:xfrm>
-                    <a:prstGeom prst="rect">
-                      <a:avLst/>
-                    </a:prstGeom>
-                  </pic:spPr>
-                </pic:pic>
-              </a:graphicData>
-            </a:graphic>
-          </wp:inline>
-        </w:drawing>
-      </w:r>
-    </w:p>
-    <w:p>
-      <w:pPr>
-        <w:keepNext w:val="false"/>
-        <w:spacing w:after="180" w:before="0" w:line="240"/>
-        <w:jc w:val="center"/>
-      </w:pPr>
-      <w:r>
-        <w:rPr>
-          <w:rFonts w:ascii="Calibri" w:cs="Calibri" w:eastAsia="Calibri" w:hAnsi="Calibri"/>
-          <w:b w:val="false"/>
-          <w:bCs w:val="false"/>
-          <w:i/>
-          <w:iCs/>
-          <w:color w:val="5B6573"/>
-          <w:sz w:val="18"/>
-          <w:szCs w:val="18"/>
-        </w:rPr>
-        <w:t xml:space="preserve">Hình 5 — Sơ đồ quyết định khi kết quả không như mong đợi.</w:t>
       </w:r>
     </w:p>
     <w:p>

</xml_diff>

<commit_message>
Update user guide and testing documentation for MEDSTAND AI; add new UAT reports and address open issues
</commit_message>
<xml_diff>
--- a/docs/GOI_UAT_KHACH_HANG/01_HUONG_DAN_SU_DUNG_MEDSTAND_AI.docx
+++ b/docs/GOI_UAT_KHACH_HANG/01_HUONG_DAN_SU_DUNG_MEDSTAND_AI.docx
@@ -325,7 +325,7 @@
                 <w:sz w:val="19"/>
                 <w:szCs w:val="19"/>
               </w:rPr>
-              <w:t xml:space="preserve">27/07/2026</w:t>
+              <w:t xml:space="preserve">01/08/2026 — frontend 11.121</w:t>
             </w:r>
           </w:p>
         </w:tc>
@@ -3180,7 +3180,7 @@
                 <w:sz w:val="22"/>
                 <w:szCs w:val="22"/>
               </w:rPr>
-              <w:t xml:space="preserve">Một truy vấn thường cần khoảng 1–5 giây. Nếu quá 15 giây, ghi nhận là phản hồi chậm; không nhấn nút gửi nhiều lần.</w:t>
+              <w:t xml:space="preserve">Kết quả kiểm tra gần nhất cho thấy đa số câu trả lời dưới 1 giây. Nếu quá 15 giây, ghi nhận là phản hồi chậm; không nhấn nút gửi nhiều lần.</w:t>
             </w:r>
           </w:p>
         </w:tc>
@@ -11433,6 +11433,88 @@
         <w:t xml:space="preserve">Nội dung liên quan sản phẩm/thuốc chỉ mang tính tham khảo và phải được người có chuyên môn kiểm tra.</w:t>
       </w:r>
     </w:p>
+    <w:tbl>
+      <w:tblPr>
+        <w:tblW w:type="dxa" w:w="9360"/>
+        <w:tblInd w:type="dxa" w:w="120"/>
+        <w:tblBorders>
+          <w:top w:val="single" w:color="auto" w:sz="4"/>
+          <w:left w:val="single" w:color="auto" w:sz="4"/>
+          <w:bottom w:val="single" w:color="auto" w:sz="4"/>
+          <w:right w:val="single" w:color="auto" w:sz="4"/>
+          <w:insideH w:val="single" w:color="auto" w:sz="4"/>
+          <w:insideV w:val="single" w:color="auto" w:sz="4"/>
+        </w:tblBorders>
+        <w:tblLayout w:type="fixed"/>
+      </w:tblPr>
+      <w:tblGrid>
+        <w:gridCol w:w="9360"/>
+      </w:tblGrid>
+      <w:tr>
+        <w:trPr>
+          <w:cantSplit/>
+          <w:tblHeader/>
+        </w:trPr>
+        <w:tc>
+          <w:tcPr>
+            <w:tcW w:type="dxa" w:w="9360"/>
+            <w:tcBorders>
+              <w:top w:val="single" w:color="8A6300" w:sz="1"/>
+              <w:left w:val="single" w:color="8A6300" w:sz="14"/>
+              <w:bottom w:val="single" w:color="8A6300" w:sz="1"/>
+              <w:right w:val="single" w:color="8A6300" w:sz="1"/>
+            </w:tcBorders>
+            <w:shd w:fill="FFF4D6" w:val="clear"/>
+            <w:tcMar>
+              <w:top w:type="dxa" w:w="140"/>
+              <w:left w:type="dxa" w:w="180"/>
+              <w:bottom w:type="dxa" w:w="140"/>
+              <w:right w:type="dxa" w:w="180"/>
+            </w:tcMar>
+          </w:tcPr>
+          <w:p>
+            <w:pPr>
+              <w:keepNext w:val="false"/>
+              <w:spacing w:after="50" w:before="0" w:line="260"/>
+              <w:jc w:val="left"/>
+            </w:pPr>
+            <w:r>
+              <w:rPr>
+                <w:rFonts w:ascii="Calibri" w:cs="Calibri" w:eastAsia="Calibri" w:hAnsi="Calibri"/>
+                <w:b/>
+                <w:bCs/>
+                <w:i w:val="false"/>
+                <w:iCs w:val="false"/>
+                <w:color w:val="8A6300"/>
+                <w:sz w:val="22"/>
+                <w:szCs w:val="22"/>
+              </w:rPr>
+              <w:t xml:space="preserve">Trạng thái UAT 01/08/2026</w:t>
+            </w:r>
+          </w:p>
+          <w:p>
+            <w:pPr>
+              <w:keepNext w:val="false"/>
+              <w:spacing w:after="0" w:before="0" w:line="280"/>
+              <w:jc w:val="left"/>
+            </w:pPr>
+            <w:r>
+              <w:rPr>
+                <w:rFonts w:ascii="Calibri" w:cs="Calibri" w:eastAsia="Calibri" w:hAnsi="Calibri"/>
+                <w:b w:val="false"/>
+                <w:bCs w:val="false"/>
+                <w:i w:val="false"/>
+                <w:iCs w:val="false"/>
+                <w:color w:val="1B1F23"/>
+                <w:sz w:val="22"/>
+                <w:szCs w:val="22"/>
+              </w:rPr>
+              <w:t xml:space="preserve">Bộ live đạt 31/31 và scope đạt 13/13 tài khoản. Hệ thống vẫn là UAT có kiểm soát, chưa phải production; quản trị viên còn phải dọn workflow n8n active trùng và chốt endpoint/secret.</w:t>
+            </w:r>
+          </w:p>
+        </w:tc>
+      </w:tr>
+    </w:tbl>
     <w:p>
       <w:pPr>
         <w:pStyle w:val="Heading1"/>

</xml_diff>